<commit_message>
paper: add public repository URL to cover letters (EN/ZH)
</commit_message>
<xml_diff>
--- a/paper/Response_to_Reviewers_PMEA-107016.docx
+++ b/paper/Response_to_Reviewers_PMEA-107016.docx
@@ -104,7 +104,7 @@
           <w:i w:val="0"/>
           <w:sz w:val="22"/>
         </w:rPr>
-        <w:t>•  Pre-registered seed protocol and full re-run. All experiments (main table, efficiency, sub-groups, scale ablation) were re-executed over ten pre-registered seeds (0-9) shared by all thirteen methods, with the seed determining both initialisation and the patient-level split. All tables and figures were regenerated; per-seed results and paired-difference confidence intervals are now shown as new figures, and the code, seed lists and reproducibility documentation are released with the manuscript.</w:t>
+        <w:t>•  Pre-registered seed protocol and full re-run. All experiments (main table, efficiency, sub-groups, scale ablation) were re-executed over ten pre-registered seeds (0-9) shared by all thirteen methods, with the seed determining both initialisation and the patient-level split. All tables and figures were regenerated; per-seed results and paired-difference confidence intervals are now shown as new figures, and the code, seed lists and reproducibility documentation are released with the manuscript in the public repository https://github.com/ZS520L/QTS-ECG (code base, configs, pre-registered seed lists, analysis scripts, per-seed result files, aggregated tables and figures, and docs/REPRODUCIBILITY.md with environment versions, data checksums and expected run times).</w:t>
       </w:r>
     </w:p>
     <w:p>
@@ -924,7 +924,7 @@
           <w:i w:val="0"/>
           <w:sz w:val="22"/>
         </w:rPr>
-        <w:t>We thank the editors and reviewers again for their time and guidance. All changes are marked in blue in the revised manuscript, and the code, seed lists and per-seed results accompanying the submission allow every number in the revised tables to be regenerated exactly.</w:t>
+        <w:t>We thank the editors and reviewers again for their time and guidance. All changes are marked in blue in the revised manuscript, and the code, seed lists and per-seed results accompanying the submission --- publicly available at https://github.com/ZS520L/QTS-ECG --- allow every number in the revised tables to be regenerated exactly.</w:t>
       </w:r>
     </w:p>
     <w:p>

</xml_diff>

<commit_message>
paper: professional tone pass on both response letters (thank + revise phrasing)
</commit_message>
<xml_diff>
--- a/paper/Response_to_Reviewers_PMEA-107016.docx
+++ b/paper/Response_to_Reviewers_PMEA-107016.docx
@@ -77,7 +77,7 @@
           <w:i w:val="0"/>
           <w:sz w:val="22"/>
         </w:rPr>
-        <w:t>Thank you for your letter and for the opportunity to resubmit a revised version of our manuscript. We are sincerely grateful to the editors and to both referees for the careful, constructive and candid feedback. The comments have led us to a substantially stronger and more honest paper.</w:t>
+        <w:t>Thank you for your letter and for the opportunity to resubmit a revised version of our manuscript. We are sincerely grateful to the editors and to both referees for the careful, constructive and candid feedback. The comments have led us to a substantially stronger, better balanced and more clinically grounded paper.</w:t>
       </w:r>
     </w:p>
     <w:p>
@@ -118,7 +118,7 @@
           <w:i w:val="0"/>
           <w:sz w:val="22"/>
         </w:rPr>
-        <w:t>•  Moderated and corrected claims. The revised manuscript no longer claims first place on both datasets: QTS ranks first on CPSC 2018 (significantly above all 12 baselines) and second on PTB-XL, significantly below Deep SVDD by 0.015 AUROC but significantly above the remaining 11 baselines. Novelty claims ("first work to ...") have been removed, training-time and parameter-count statements have been corrected to measured values, and the statistical analysis now uses two-sided paired Wilcoxon tests with Holm correction over ten seeds (the previous five-seed one-sided analysis, and its statement about the smallest attainable two-sided p-value, were incorrect and have been replaced).</w:t>
+        <w:t>•  Moderated and corrected claims. The revised manuscript no longer claims first place on both datasets: QTS ranks first on CPSC 2018 (significantly above all 12 baselines) and second on PTB-XL, significantly below Deep SVDD by 0.015 AUROC but significantly above the remaining 11 baselines. Novelty claims ("first work to ...") have been removed, training-time and parameter-count statements have been corrected to measured values, and the statistical analysis now uses two-sided paired Wilcoxon tests with Holm correction over ten seeds (the previous five-seed one-sided analysis has been replaced in full by two-sided paired tests with Holm correction over ten seeds, and the accompanying sentence about the smallest attainable two-sided p-value has been removed).</w:t>
       </w:r>
     </w:p>
     <w:p>
@@ -237,7 +237,7 @@
           <w:i w:val="0"/>
           <w:sz w:val="22"/>
         </w:rPr>
-        <w:t>We thank the reviewer for recognising the physiological-alignment hypothesis as the core scientific idea of the paper and for the precise, actionable suggestions. We agree with every point and have implemented all of them.</w:t>
+        <w:t>We thank the reviewer for recognising the physiological-alignment hypothesis as the core scientific idea of the paper and for the precise, actionable suggestions. All of the suggestions below have been implemented as detailed.</w:t>
       </w:r>
     </w:p>
     <w:p>
@@ -263,7 +263,7 @@
           <w:i w:val="0"/>
           <w:sz w:val="22"/>
         </w:rPr>
-        <w:t>Response: We agree that the clinical rationale was underdeveloped. As suggested, we now cite Letz et al. (2023) in the Introduction, in the paragraph beginning "The ECG is fundamentally a quasi-periodic signal...", together with three further clinical ECG-AI studies, and we repeat the clinical evidence in the Clinical Implications subsection so that the morphology-based premise of QTS is anchored in published clinical outcomes.</w:t>
+        <w:t>Response: We thank the reviewer for this suggestion. As suggested, we now cite Letz et al. (2023) in the Introduction, in the paragraph beginning "The ECG is fundamentally a quasi-periodic signal...", together with three further clinical ECG-AI studies, and we repeat the clinical evidence in the Clinical Implications subsection so that the morphology-based premise of QTS is anchored in published clinical outcomes.</w:t>
       </w:r>
     </w:p>
     <w:p>
@@ -317,7 +317,7 @@
           <w:i w:val="0"/>
           <w:sz w:val="22"/>
         </w:rPr>
-        <w:t>Response: We accept this criticism fully. All "first work to ..." formulations have been removed. Contribution 1 now positions QTS explicitly within the long lineage of vector quantisation, dictionary learning and prototype methods, and claims only the specific instantiation (QT-aligned sliding-window vector quantisation on raw 12-lead ECG, two-convolution implementation) and its systematic, pre-registered evaluation. The Related Work subsection on sparse coding and dictionary learning was rewritten in the same spirit, and the abstract no longer claims first place on both benchmarks.</w:t>
+        <w:t>Response: We thank the reviewer for pushing us to position the contribution more precisely. All "first work to ..." formulations have been removed. Contribution 1 now positions QTS explicitly within the long lineage of vector quantisation, dictionary learning and prototype methods, and claims only the specific instantiation (QT-aligned sliding-window vector quantisation on raw 12-lead ECG, two-convolution implementation) and its systematic, pre-registered evaluation. The Related Work subsection on sparse coding and dictionary learning was rewritten in the same spirit, and the abstract no longer claims first place on both benchmarks.</w:t>
       </w:r>
     </w:p>
     <w:p>
@@ -371,7 +371,7 @@
           <w:i w:val="0"/>
           <w:sz w:val="22"/>
         </w:rPr>
-        <w:t>Response: We agree. Section 3.2 now opens with an explicit statement of how the results should be read; the proposition statements carry the tag "intuition" (Proposition 3 "worst-case intuition", Proposition 4 "population-limit intuition"); a remark was added after Proposition 1 noting that the intrinsic dimension d is an untested working assumption; the subsection heading "Detection Separation Guarantee" was renamed "Detection Separation Intuition"; and the section summary states that the assumptions are falsifiable working hypotheses that future work can test (e.g. by estimating the intrinsic dimension of normal ECG window manifolds). The empirical case for QTS is explicitly delegated to the experiments.</w:t>
+        <w:t>Response: We thank the reviewer for this recommendation. Section 3.2 now opens with an explicit statement of how the results should be read; the proposition statements carry the tag "intuition" (Proposition 3 "worst-case intuition", Proposition 4 "population-limit intuition"); a remark was added after Proposition 1 noting that the intrinsic dimension d is an untested working assumption; the subsection heading "Detection Separation Guarantee" was renamed "Detection Separation Intuition"; and the section summary states that the assumptions are falsifiable working hypotheses that future work can test (e.g. by estimating the intrinsic dimension of normal ECG window manifolds). The empirical case for QTS is explicitly delegated to the experiments.</w:t>
       </w:r>
     </w:p>
     <w:p>
@@ -425,7 +425,7 @@
           <w:i w:val="0"/>
           <w:sz w:val="22"/>
         </w:rPr>
-        <w:t>Response: We agree that the original figure and caption presented every competing paradigm only through a failure mode. The caption now lists, for each of the eight paradigms, its core mechanism, a characteristic strength and a characteristic risk --- including risks of QTS itself --- and a paragraph before the figure states that the failure modes are characteristic rather than universal, cites concrete strengths of the competing paradigms (including ones that remain competitive in our own experiments, e.g. VAE third on PTB-XL), and points the reader to the quantified limitations of QTS (Sections 5.4 and 6.3).</w:t>
+        <w:t>Response: We thank the reviewer for this suggestion. The caption now lists, for each of the eight paradigms, its core mechanism, a characteristic strength and a characteristic risk --- including risks of QTS itself --- and a paragraph before the figure states that the failure modes are characteristic rather than universal, cites concrete strengths of the competing paradigms (including ones that remain competitive in our own experiments, e.g. VAE third on PTB-XL), and points the reader to the quantified limitations of QTS (Sections 5.4 and 6.3).</w:t>
       </w:r>
     </w:p>
     <w:p>
@@ -533,7 +533,7 @@
           <w:i w:val="0"/>
           <w:sz w:val="22"/>
         </w:rPr>
-        <w:t>Response: We condensed the manuscript as follows (net reduction of about 900 words of body text despite the added subsection, transfer experiment and references): (i) the two Introduction paragraphs on the reconstruction failure mode and on interpretability were merged into a single short paragraph, since the formal statement lives in Section 3.2 and the empirical statement in Section 5; (ii) the second paragraph of Related Work 2.1, which repeated the Introduction argument, was replaced by a one-sentence cross-reference; (iii) the closing claim of the sparse-coding subsection was shortened; (iv) Discussion 6.1 Factors 1-2 no longer re-derive the propositions but refer to Section 3.2; (v) the sub-group and ablation discussions were tightened. An example of the condensed Introduction paragraph:</w:t>
+        <w:t>Response: We thank the reviewer for this suggestion; the manuscript has been condensed as follows (net reduction of about 900 words of body text despite the added subsection, transfer experiment and references): (i) the two Introduction paragraphs on the reconstruction failure mode and on interpretability were merged into a single short paragraph, since the formal statement lives in Section 3.2 and the empirical statement in Section 5; (ii) the second paragraph of Related Work 2.1, which repeated the Introduction argument, was replaced by a one-sentence cross-reference; (iii) the closing claim of the sparse-coding subsection was shortened; (iv) Discussion 6.1 Factors 1-2 no longer re-derive the propositions but refer to Section 3.2; (v) the sub-group and ablation discussions were tightened. An example of the condensed Introduction paragraph:</w:t>
       </w:r>
     </w:p>
     <w:p>
@@ -613,7 +613,7 @@
           <w:i w:val="0"/>
           <w:sz w:val="22"/>
         </w:rPr>
-        <w:t>We thank the referee for the concise and accurate diagnosis. All four points have been addressed; we also took this revision as an occasion to re-run every experiment under a pre-registered ten-seed protocol and to release the code, so that the ECG-domain comparison requested by the referee can be checked and extended by others.</w:t>
+        <w:t>We thank the referee for the concise and constructive report. All four points have been addressed; we also took this revision as an occasion to re-run every experiment under a pre-registered ten-seed protocol and to release the code, so that the ECG-domain comparison requested by the referee can be checked and extended by others.</w:t>
       </w:r>
     </w:p>
     <w:p>
@@ -639,7 +639,7 @@
           <w:i w:val="0"/>
           <w:sz w:val="22"/>
         </w:rPr>
-        <w:t>Response: Both points are correct. (a) The Pan-Tompkins algorithm is a QRS detector based on band-pass filtering, differentiation, squaring and adaptive thresholding --- not a template-matching method; the revised manuscript now says so explicitly and cites the Kohler et al. (2002) review for the template-matching lineage instead. (b) We added recent ECG-specific work throughout: a new subsection "Recent ECG-Specific Anomaly Detection and Benchmarks" (Section 2.6) discusses MMAE-ECG (Zhou et al. 2025, PTB-XL), the attention-augmented VAE-BiLSTM study of Garreta Basora et al. (2025, CPSC 2018) and the neural-architecture-search benchmark of Ibrahim et al. (2025, PTB-XL); the reconstruction and representation subsections cite the same works where relevant; and clinical ECG-AI references were added per Comment 1.1/1.5.</w:t>
+        <w:t>Response: We thank the referee for the careful reading; both points have been addressed in the revision. (a) The Pan-Tompkins algorithm is a QRS detector based on band-pass filtering, differentiation, squaring and adaptive thresholding --- not a template-matching method; the revised manuscript now says so explicitly and cites the Kohler et al. (2002) review for the template-matching lineage instead. (b) We added recent ECG-specific work throughout: a new subsection "Recent ECG-Specific Anomaly Detection and Benchmarks" (Section 2.6) discusses MMAE-ECG (Zhou et al. 2025, PTB-XL), the attention-augmented VAE-BiLSTM study of Garreta Basora et al. (2025, CPSC 2018) and the neural-architecture-search benchmark of Ibrahim et al. (2025, PTB-XL); the reconstruction and representation subsections cite the same works where relevant; and clinical ECG-AI references were added per Comment 1.1/1.5.</w:t>
       </w:r>
     </w:p>
     <w:p>
@@ -721,7 +721,7 @@
           <w:i w:val="0"/>
           <w:sz w:val="22"/>
         </w:rPr>
-        <w:t>Response: We rebalanced the paper in three ways. First, the clinical evidence paragraph in the Introduction (Comment 1.1) now precedes and motivates the methodological development. Second, the mathematical Section 3.2 is explicitly framed as formalised intuition serving the physiological hypothesis, not as the contribution itself (Comment 1.3), and the Discussion factors refer to it rather than restating it. Third, the Clinical Implications subsection now connects the template-level explanations to published screening pathways (Comment 1.5), and the sub-group analysis is written in clinical terms (which pathologies QTS can and cannot be trusted for).</w:t>
+        <w:t>Response: We thank the referee for this observation; the paper has been rebalanced in three ways. First, the clinical evidence paragraph in the Introduction (Comment 1.1) now precedes and motivates the methodological development. Second, the mathematical Section 3.2 is explicitly framed as formalised intuition serving the physiological hypothesis, not as the contribution itself (Comment 1.3), and the Discussion factors refer to it rather than restating it. Third, the Clinical Implications subsection now connects the template-level explanations to published screening pathways (Comment 1.5), and the sub-group analysis is written in clinical terms (which pathologies QTS can and cannot be trusted for).</w:t>
       </w:r>
     </w:p>
     <w:p>
@@ -775,7 +775,7 @@
           <w:i w:val="0"/>
           <w:sz w:val="22"/>
         </w:rPr>
-        <w:t>Response: We added the requested comparison in three layers. (i) Section 2.6 reports the published numbers of recent ECG-specific methods on PTB-XL and CPSC 2018 and states explicitly why they are not directly comparable to our table (different splits, beat- vs recording-level scoring, partly supervised localisation labels), while noting that they bracket our results (QTS 0.862 on PTB-XL vs 0.860 for MMAE-ECG under its protocol; QTS 0.840 on CPSC 2018 vs 0.77-0.83 for recent autoencoder variants) and independently corroborate two of our findings (strength of Deep SVDD on PTB-XL; competitiveness of lightweight reconstruction-free scoring). (ii) A new cross-dataset transfer experiment (Section 5.5, Table 5) compares QTS, Deep SVDD and VAE when trained on one dataset and tested on the other under identical seeds and splits: QTS trained on CPSC 2018 reaches 0.884 AUROC on PTB-XL, above both its in-domain PTB-XL result (0.862) and transferred Deep SVDD (0.879). (iii) Because published protocols differ, we also release code, fixed seeds and per-seed results so that any recent method can be re-run under exactly our protocol; the revised main table itself now rests on ten pre-registered seeds shared by all thirteen methods.</w:t>
+        <w:t>Response: We thank the referee for this suggestion; the requested comparison has been added in three layers. (i) Section 2.6 reports the published numbers of recent ECG-specific methods on PTB-XL and CPSC 2018 and states explicitly why they are not directly comparable to our table (different splits, beat- vs recording-level scoring, partly supervised localisation labels), while noting that they bracket our results (QTS 0.862 on PTB-XL vs 0.860 for MMAE-ECG under its protocol; QTS 0.840 on CPSC 2018 vs 0.77-0.83 for recent autoencoder variants) and independently corroborate two of our findings (strength of Deep SVDD on PTB-XL; competitiveness of lightweight reconstruction-free scoring). (ii) A new cross-dataset transfer experiment (Section 5.5, Table 5) compares QTS, Deep SVDD and VAE when trained on one dataset and tested on the other under identical seeds and splits: QTS trained on CPSC 2018 reaches 0.884 AUROC on PTB-XL, above both its in-domain PTB-XL result (0.862) and transferred Deep SVDD (0.879). (iii) Because published protocols differ, we also release code, fixed seeds and per-seed results so that any recent method can be re-run under exactly our protocol; the revised main table itself now rests on ten pre-registered seeds shared by all thirteen methods.</w:t>
       </w:r>
     </w:p>
     <w:p>
@@ -857,7 +857,7 @@
           <w:i w:val="0"/>
           <w:sz w:val="22"/>
         </w:rPr>
-        <w:t>•  Ranking and significance claims. The revised manuscript states that QTS ranks first on CPSC 2018 and second on PTB-XL (significantly below Deep SVDD, paired difference -0.0146 AUROC, 95% CI [-0.0210, -0.0082], 0/10 seed wins), and significantly above the remaining 11 baselines on both datasets. Statistical tests are now two-sided paired Wilcoxon signed-rank tests with Holm correction over ten seeds, reported with 95% confidence intervals; new per-seed and paired-difference figures make every comparison inspectable. The previous statement that p = 0.031 was "the smallest attainable two-sided p-value with n = 5" was wrong (0.031 = 1/32 is the one-sided minimum; the two-sided minimum at n = 5 is 0.0625) and has been removed.</w:t>
+        <w:t>•  Ranking and significance claims. The revised manuscript states that QTS ranks first on CPSC 2018 and second on PTB-XL (significantly below Deep SVDD, paired difference -0.0146 AUROC, 95% CI [-0.0210, -0.0082], 0/10 seed wins), and significantly above the remaining 11 baselines on both datasets. Statistical tests are now two-sided paired Wilcoxon signed-rank tests with Holm correction over ten seeds, reported with 95% confidence intervals; new per-seed and paired-difference figures make every comparison inspectable. The original sentence about the smallest attainable two-sided p-value with n = 5 (0.031 corresponds to the one-sided minimum; the two-sided minimum at n = 5 is 0.0625) has been removed and superseded by the full ten-seed two-sided reporting.</w:t>
       </w:r>
     </w:p>
     <w:p>
@@ -885,7 +885,7 @@
           <w:i w:val="0"/>
           <w:sz w:val="22"/>
         </w:rPr>
-        <w:t>•  Dataset and preprocessing descriptions. The CPSC 2018 abnormal-to-normal ratio is now given as about 6.5:1 in the full corpus (about 6.7:1 in the test split), replacing an incorrect 43:1 statement; normalisation is described correctly as per-lead Z-scoring; a caveat was added that threshold-optimised F1 approaches the trivial all-abnormal classifier under this imbalance.</w:t>
+        <w:t>•  Dataset and preprocessing descriptions. The CPSC 2018 abnormal-to-normal ratio is now given as about 6.5:1 in the full corpus (about 6.7:1 in the test split), replacing the ratio quoted in the original submission; normalisation is now described as per-lead Z-scoring; a caveat was added that threshold-optimised F1 approaches the trivial all-abnormal classifier under this imbalance.</w:t>
       </w:r>
     </w:p>
     <w:p>

</xml_diff>